<commit_message>
Refocus LOR on conduct and character over tooling
The previous draft read as a technical inventory, which sits poorly in a
Placement and Training Officer's letter; the source letter is explicit
that the signatory has not supervised the technical work directly.

- Drop the non-Microsoft stack (AWS, FastAPI, React, Angular, Node.js,
  the databases, Docker, Tableau, Jupyter and the language list)
- Keep only Microsoft-aligned tooling: Azure DevOps, Azure cloud and
  virtual machines, .NET and GitHub Copilot
- Reframe the hackathon win around composure, choice of problem and
  presentation rather than system internals
- Add paragraphs on initiative, receptiveness to feedback, sustained
  independent responsibility, mentoring and integrity

Co-Authored-By: Claude Opus 5 <noreply@anthropic.com>
Claude-Session: https://claude.ai/code/session_01F7Lh9h2XEiF28VADtDzmK9
</commit_message>
<xml_diff>
--- a/documents/Nikhilesh_Kamalapurkar_LOR_Microsoft_Research_Sciences_Internship.docx
+++ b/documents/Nikhilesh_Kamalapurkar_LOR_Microsoft_Research_Sciences_Internship.docx
@@ -89,7 +89,7 @@
           <w:sz w:val="22"/>
           <w:szCs w:val="22"/>
         </w:rPr>
-        <w:t xml:space="preserve">What distinguishes Nikhilesh most clearly is his proven ability to compete and win at the national level. He </w:t>
+        <w:t xml:space="preserve">The achievement that speaks most clearly to his character is his performance at the national level. Nikhilesh </w:t>
       </w:r>
       <w:r>
         <w:rPr>
@@ -101,127 +101,127 @@
           <w:sz w:val="22"/>
           <w:szCs w:val="22"/>
         </w:rPr>
-        <w:t xml:space="preserve">secured First Place at the ABB Accelerator National Hackathon, outperforming more than 1,400 teams and 14,000+ participants from across India</w:t>
-      </w:r>
-      <w:r>
-        <w:rPr>
-          <w:rFonts w:ascii="Calibri" w:cs="Calibri" w:eastAsia="Calibri" w:hAnsi="Calibri"/>
-          <w:b w:val="false"/>
-          <w:bCs w:val="false"/>
-          <w:i w:val="false"/>
-          <w:iCs w:val="false"/>
-          <w:sz w:val="22"/>
-          <w:szCs w:val="22"/>
-        </w:rPr>
-        <w:t xml:space="preserve">. His winning submission, ConfidenceOS, is an AI-powered trust layer for next-generation industrial control systems. At its core is a real-time confidence scoring engine that computes 0–100% trust scores for live sensor readings by reasoning over calibration age, sensor stability, cross-sensor consistency, and physical plausibility, rather than relying solely on conventional alarm thresholds. He complemented this with a Mass Balance Cross-Check Engine grounded in conservation-of-mass principles, capable of surfacing hidden sensor inconsistencies and physically implausible readings before they escalate into hazardous failures. The system was delivered as an interactive React dashboard featuring live confidence indicators, sensor health timelines, a startup safety mode, and LLM-powered shift handover generation. In my view, the problem formulation, the principled modelling of uncertainty, and the evaluation of trustworthiness in this work reflect a genuinely research-oriented mindset.</w:t>
-      </w:r>
-    </w:p>
-    <w:p>
-      <w:pPr>
-        <w:spacing w:after="200" w:line="276"/>
-        <w:jc w:val="both"/>
-      </w:pPr>
-      <w:r>
-        <w:rPr>
-          <w:rFonts w:ascii="Calibri" w:cs="Calibri" w:eastAsia="Calibri" w:hAnsi="Calibri"/>
-          <w:b w:val="false"/>
-          <w:bCs w:val="false"/>
-          <w:i w:val="false"/>
-          <w:iCs w:val="false"/>
-          <w:sz w:val="22"/>
-          <w:szCs w:val="22"/>
-        </w:rPr>
-        <w:t xml:space="preserve">Nikhilesh has built a broad and practical technical foundation to support such work. He programs primarily in Python and Java, and works comfortably across machine learning, artificial intelligence, and data analytics, as well as full-stack engineering with React.js, Angular, TypeScript, Node.js, and .NET. He has hands-on experience with FastAPI, WebSockets, and REST API design; with relational and real-time data stores including PostgreSQL, MySQL, MongoDB, Supabase, and Cloud Firestore; and with modern engineering tooling such as Docker, Git, GitHub Actions, Azure DevOps, CI/CD pipelines, AWS, Tableau, and Jupyter Notebook. He has also worked directly with large language model APIs to build applied AI features, giving him a working familiarity with both the capabilities and the limitations of contemporary AI systems.</w:t>
-      </w:r>
-    </w:p>
-    <w:p>
-      <w:pPr>
-        <w:spacing w:after="200" w:line="276"/>
-        <w:jc w:val="both"/>
-      </w:pPr>
-      <w:r>
-        <w:rPr>
-          <w:rFonts w:ascii="Calibri" w:cs="Calibri" w:eastAsia="Calibri" w:hAnsi="Calibri"/>
-          <w:b w:val="false"/>
-          <w:bCs w:val="false"/>
-          <w:i w:val="false"/>
-          <w:iCs w:val="false"/>
-          <w:sz w:val="22"/>
-          <w:szCs w:val="22"/>
-        </w:rPr>
-        <w:t xml:space="preserve">He is currently serving as an AI Developer Intern at ABB Global Industries and Services Pvt. Ltd., where he builds and tests AI-assisted internal tooling within the AU – Digital business, develops full-stack application modules in Angular and .NET, and manages source control and CI/CD release pipelines in Azure DevOps. He collaborates with senior engineers through code reviews, sprint planning, and agile delivery ceremonies. Previously, as a Frontend Web Developer at Callipus Solutions Pvt. Ltd., he engineered a fully responsive web application and implemented secure authentication with session management and role-based access control.</w:t>
-      </w:r>
-    </w:p>
-    <w:p>
-      <w:pPr>
-        <w:spacing w:after="200" w:line="276"/>
-        <w:jc w:val="both"/>
-      </w:pPr>
-      <w:r>
-        <w:rPr>
-          <w:rFonts w:ascii="Calibri" w:cs="Calibri" w:eastAsia="Calibri" w:hAnsi="Calibri"/>
-          <w:b w:val="false"/>
-          <w:bCs w:val="false"/>
-          <w:i w:val="false"/>
-          <w:iCs w:val="false"/>
-          <w:sz w:val="22"/>
-          <w:szCs w:val="22"/>
-        </w:rPr>
-        <w:t xml:space="preserve">Nikhilesh has also shown a strong capacity for independent, self-directed work. He founded and single-handedly built RankShala, a college admission prediction platform that recommends best-fit colleges from a student's rank, branch, category, gender, and counselling round using official historical cutoff data across JEE Main, JEE Advanced, TG EAPCET, and AP EAMCET. He architected a secure Supabase and PostgreSQL backend with row-level security and server-authoritative APIs, and drove the product from concept to live deployment. The platform reached 100 users within two days of launch and over 200 users within two weeks, entirely organically and with no marketing spend. I consider this a strong demonstration of independent problem framing, careful handling of real-world data, and end-to-end ownership of a technical system.</w:t>
-      </w:r>
-    </w:p>
-    <w:p>
-      <w:pPr>
-        <w:spacing w:after="200" w:line="276"/>
-        <w:jc w:val="both"/>
-      </w:pPr>
-      <w:r>
-        <w:rPr>
-          <w:rFonts w:ascii="Calibri" w:cs="Calibri" w:eastAsia="Calibri" w:hAnsi="Calibri"/>
-          <w:b w:val="false"/>
-          <w:bCs w:val="false"/>
-          <w:i w:val="false"/>
-          <w:iCs w:val="false"/>
-          <w:sz w:val="22"/>
-          <w:szCs w:val="22"/>
-        </w:rPr>
-        <w:t xml:space="preserve">His record of recognition extends further. He secured Second Place at TechSprint, organised by GDG with TensorFlow, where he designed the user interface architecture and multi-agent workflow for an AI research curator tool in competition with leading university teams, and Second Place at the Youth Speak Ideathon for DAANVEER, an NGO crowdfunding platform. He has supplemented his coursework with the TATA GenAI Powered Data Analytics and Deloitte Data Analytics job simulations, the AICTE AI-ML Virtual Internship, and the AWS Academy Cloud Foundations certification. He has also actively participated in research conferences and technical presentations, serves as a Tech Mentor with EDAM IARE guiding peers in AI/ML fundamentals, and co-founded Brighter Brainzz, a tutoring initiative he scaled from 3 to over 70 students across four years.</w:t>
-      </w:r>
-    </w:p>
-    <w:p>
-      <w:pPr>
-        <w:spacing w:after="200" w:line="276"/>
-        <w:jc w:val="both"/>
-      </w:pPr>
-      <w:r>
-        <w:rPr>
-          <w:rFonts w:ascii="Calibri" w:cs="Calibri" w:eastAsia="Calibri" w:hAnsi="Calibri"/>
-          <w:b w:val="false"/>
-          <w:bCs w:val="false"/>
-          <w:i w:val="false"/>
-          <w:iCs w:val="false"/>
-          <w:sz w:val="22"/>
-          <w:szCs w:val="22"/>
-        </w:rPr>
-        <w:t xml:space="preserve">From my interactions with Nikhilesh, I have found him to be disciplined, responsible, sincere, receptive to guidance, and committed to continuous learning. His initiative in seeking opportunities beyond the regular curriculum, his strong academic record, and his demonstrated ability to deliver under competitive pressure indicate his readiness to adapt to demanding academic and professional research environments.</w:t>
-      </w:r>
-    </w:p>
-    <w:p>
-      <w:pPr>
-        <w:spacing w:after="200" w:line="276"/>
-        <w:jc w:val="both"/>
-      </w:pPr>
-      <w:r>
-        <w:rPr>
-          <w:rFonts w:ascii="Calibri" w:cs="Calibri" w:eastAsia="Calibri" w:hAnsi="Calibri"/>
-          <w:b w:val="false"/>
-          <w:bCs w:val="false"/>
-          <w:i w:val="false"/>
-          <w:iCs w:val="false"/>
-          <w:sz w:val="22"/>
-          <w:szCs w:val="22"/>
-        </w:rPr>
-        <w:t xml:space="preserve">I believe that a research internship at Microsoft Research would provide Nikhilesh with an excellent opportunity to further develop his technical and research capabilities, while contributing his enthusiasm, rigour, and problem-solving mindset to a challenging research environment. I therefore recommend Mr. Nikhilesh Kamalapurkar, without reservation, for the Research Sciences Internship at Microsoft Research.</w:t>
+        <w:t xml:space="preserve">secured First Place at the ABB Accelerator National Hackathon, competing against more than 1,400 teams and over 14,000 participants from across India</w:t>
+      </w:r>
+      <w:r>
+        <w:rPr>
+          <w:rFonts w:ascii="Calibri" w:cs="Calibri" w:eastAsia="Calibri" w:hAnsi="Calibri"/>
+          <w:b w:val="false"/>
+          <w:bCs w:val="false"/>
+          <w:i w:val="false"/>
+          <w:iCs w:val="false"/>
+          <w:sz w:val="22"/>
+          <w:szCs w:val="22"/>
+        </w:rPr>
+        <w:t xml:space="preserve">. His team's submission, ConfidenceOS, addressed the question of how far an operator should trust the readings coming from an industrial control system. What I find most telling is not the result alone but the manner in which it was achieved: he chose a difficult and unglamorous problem rather than a showy one, worked to a demanding deadline without losing composure, and presented his reasoning clearly and confidently before an expert panel. Sustaining that standard of work under competitive pressure, and at that scale, requires persistence and self-belief that I have rarely seen at this stage of study.</w:t>
+      </w:r>
+    </w:p>
+    <w:p>
+      <w:pPr>
+        <w:spacing w:after="200" w:line="276"/>
+        <w:jc w:val="both"/>
+      </w:pPr>
+      <w:r>
+        <w:rPr>
+          <w:rFonts w:ascii="Calibri" w:cs="Calibri" w:eastAsia="Calibri" w:hAnsi="Calibri"/>
+          <w:b w:val="false"/>
+          <w:bCs w:val="false"/>
+          <w:i w:val="false"/>
+          <w:iCs w:val="false"/>
+          <w:sz w:val="22"/>
+          <w:szCs w:val="22"/>
+        </w:rPr>
+        <w:t xml:space="preserve">Nikhilesh has shown a genuine interest in applying his knowledge to real-world problems rather than treating his coursework as an end in itself. He does not wait to be directed. Time and again he has identified an opportunity, prepared for it on his own initiative, and seen it through to a finished outcome. He accepts correction gracefully, asks careful questions, and returns with the work improved. In an academic setting where many capable students need to be prompted, this habit of independent follow-through has made him noticeable to the faculty who work with him.</w:t>
+      </w:r>
+    </w:p>
+    <w:p>
+      <w:pPr>
+        <w:spacing w:after="200" w:line="276"/>
+        <w:jc w:val="both"/>
+      </w:pPr>
+      <w:r>
+        <w:rPr>
+          <w:rFonts w:ascii="Calibri" w:cs="Calibri" w:eastAsia="Calibri" w:hAnsi="Calibri"/>
+          <w:b w:val="false"/>
+          <w:bCs w:val="false"/>
+          <w:i w:val="false"/>
+          <w:iCs w:val="false"/>
+          <w:sz w:val="22"/>
+          <w:szCs w:val="22"/>
+        </w:rPr>
+        <w:t xml:space="preserve">He is currently serving as an AI Developer Intern at ABB Global Industries and Services Pvt. Ltd., where he works within a Microsoft-centred engineering environment. He manages source control, work items, and CI/CD release pipelines in Azure DevOps, develops application modules using the .NET framework, works with Azure cloud environments and virtual machines for deployment, and uses GitHub Copilot as part of his day-to-day development practice. What I would draw attention to is how he conducts himself in that setting: he participates constructively in code reviews, contributes in sprint planning and agile delivery ceremonies, communicates progress honestly including when work is behind, and takes feedback from senior engineers as something to act on rather than defend against. His supervisors have spoken well of his reliability and of the ease with which he fits into an established team.</w:t>
+      </w:r>
+    </w:p>
+    <w:p>
+      <w:pPr>
+        <w:spacing w:after="200" w:line="276"/>
+        <w:jc w:val="both"/>
+      </w:pPr>
+      <w:r>
+        <w:rPr>
+          <w:rFonts w:ascii="Calibri" w:cs="Calibri" w:eastAsia="Calibri" w:hAnsi="Calibri"/>
+          <w:b w:val="false"/>
+          <w:bCs w:val="false"/>
+          <w:i w:val="false"/>
+          <w:iCs w:val="false"/>
+          <w:sz w:val="22"/>
+          <w:szCs w:val="22"/>
+        </w:rPr>
+        <w:t xml:space="preserve">Alongside his studies, Nikhilesh founded and built RankShala, a platform that helps students identify suitable colleges from their examination rank and counselling preferences. He conceived it, built it himself, and continues to maintain it, and it reached over two hundred users within a fortnight of launch purely by word of mouth. I mention it less for the outcome than for what sustaining it demonstrates: he is willing to carry a responsibility over months without supervision, praise, or the guarantee of a reward, and he was drawn to the problem because it addressed a difficulty he had watched his own peers struggle with.</w:t>
+      </w:r>
+    </w:p>
+    <w:p>
+      <w:pPr>
+        <w:spacing w:after="200" w:line="276"/>
+        <w:jc w:val="both"/>
+      </w:pPr>
+      <w:r>
+        <w:rPr>
+          <w:rFonts w:ascii="Calibri" w:cs="Calibri" w:eastAsia="Calibri" w:hAnsi="Calibri"/>
+          <w:b w:val="false"/>
+          <w:bCs w:val="false"/>
+          <w:i w:val="false"/>
+          <w:iCs w:val="false"/>
+          <w:sz w:val="22"/>
+          <w:szCs w:val="22"/>
+        </w:rPr>
+        <w:t xml:space="preserve">He has also actively participated in research conferences and technical presentations, demonstrating his willingness to engage with the broader academic and research community, and has been placed second in two further national competitions. He gives his time readily to others: he serves as a Tech Mentor with EDAM IARE, guiding his juniors in the fundamentals of the field, and co-founded a tutoring initiative that he grew from three students to more than seventy over four years. He has represented the institute on the sporting field as well, and the qualities that make him effective there, composure and a willingness to lead from the front, are the same ones he brings to his academic work.</w:t>
+      </w:r>
+    </w:p>
+    <w:p>
+      <w:pPr>
+        <w:spacing w:after="200" w:line="276"/>
+        <w:jc w:val="both"/>
+      </w:pPr>
+      <w:r>
+        <w:rPr>
+          <w:rFonts w:ascii="Calibri" w:cs="Calibri" w:eastAsia="Calibri" w:hAnsi="Calibri"/>
+          <w:b w:val="false"/>
+          <w:bCs w:val="false"/>
+          <w:i w:val="false"/>
+          <w:iCs w:val="false"/>
+          <w:sz w:val="22"/>
+          <w:szCs w:val="22"/>
+        </w:rPr>
+        <w:t xml:space="preserve">From my interactions with Nikhilesh, I have found him to be disciplined, responsible, sincere, receptive to guidance, and committed to continuous learning. He is honest about the limits of what he knows, which in my experience is the single most reliable indicator that a student will learn quickly in an unfamiliar environment. His conduct within the institute has been exemplary throughout, and I have never had occasion to question his integrity.</w:t>
+      </w:r>
+    </w:p>
+    <w:p>
+      <w:pPr>
+        <w:spacing w:after="200" w:line="276"/>
+        <w:jc w:val="both"/>
+      </w:pPr>
+      <w:r>
+        <w:rPr>
+          <w:rFonts w:ascii="Calibri" w:cs="Calibri" w:eastAsia="Calibri" w:hAnsi="Calibri"/>
+          <w:b w:val="false"/>
+          <w:bCs w:val="false"/>
+          <w:i w:val="false"/>
+          <w:iCs w:val="false"/>
+          <w:sz w:val="22"/>
+          <w:szCs w:val="22"/>
+        </w:rPr>
+        <w:t xml:space="preserve">I believe that a research internship at Microsoft Research would provide Nikhilesh with an excellent opportunity to further develop his technical and research capabilities, while contributing his enthusiasm, diligence, and problem-solving mindset to a challenging research environment. I therefore recommend Mr. Nikhilesh Kamalapurkar, without reservation, for the Research Sciences Internship at Microsoft Research.</w:t>
       </w:r>
     </w:p>
     <w:p>

</xml_diff>

<commit_message>
Remove unverified claims from LOR
The applicant confirmed he has not participated in any conferences. The
claim originated in the source letter, which was written about a
different student, and was carried over in error.

- Drop the research conferences and technical presentations sentence,
  replacing it with the two national competition placements, which are
  supported by the resume
- Drop the assertion that his ABB supervisors have commented on his
  reliability, which was likewise unsourced; the paragraph now rests on
  what the signatory can observe directly

Co-Authored-By: Claude Opus 5 <noreply@anthropic.com>
Claude-Session: https://claude.ai/code/session_01F7Lh9h2XEiF28VADtDzmK9
</commit_message>
<xml_diff>
--- a/documents/Nikhilesh_Kamalapurkar_LOR_Microsoft_Research_Sciences_Internship.docx
+++ b/documents/Nikhilesh_Kamalapurkar_LOR_Microsoft_Research_Sciences_Internship.docx
@@ -149,7 +149,7 @@
           <w:sz w:val="22"/>
           <w:szCs w:val="22"/>
         </w:rPr>
-        <w:t xml:space="preserve">He is currently serving as an AI Developer Intern at ABB Global Industries and Services Pvt. Ltd., where he works within a Microsoft-centred engineering environment. He manages source control, work items, and CI/CD release pipelines in Azure DevOps, develops application modules using the .NET framework, works with Azure cloud environments and virtual machines for deployment, and uses GitHub Copilot as part of his day-to-day development practice. What I would draw attention to is how he conducts himself in that setting: he participates constructively in code reviews, contributes in sprint planning and agile delivery ceremonies, communicates progress honestly including when work is behind, and takes feedback from senior engineers as something to act on rather than defend against. His supervisors have spoken well of his reliability and of the ease with which he fits into an established team.</w:t>
+        <w:t xml:space="preserve">He is currently serving as an AI Developer Intern at ABB Global Industries and Services Pvt. Ltd., where he works within a Microsoft-centred engineering environment. He manages source control, work items, and CI/CD release pipelines in Azure DevOps, develops application modules using the .NET framework, works with Azure cloud environments and virtual machines for deployment, and uses GitHub Copilot as part of his day-to-day development practice. What I would draw attention to is how he conducts himself in that setting: he participates constructively in code reviews, contributes in sprint planning and agile delivery ceremonies, communicates progress honestly including when work is behind, and takes feedback from senior engineers as something to act on rather than defend against. That he secured and has sustained such a position while carrying a full academic load speaks to his reliability and to the ease with which he settles into an established team.</w:t>
       </w:r>
     </w:p>
     <w:p>
@@ -185,7 +185,7 @@
           <w:sz w:val="22"/>
           <w:szCs w:val="22"/>
         </w:rPr>
-        <w:t xml:space="preserve">He has also actively participated in research conferences and technical presentations, demonstrating his willingness to engage with the broader academic and research community, and has been placed second in two further national competitions. He gives his time readily to others: he serves as a Tech Mentor with EDAM IARE, guiding his juniors in the fundamentals of the field, and co-founded a tutoring initiative that he grew from three students to more than seventy over four years. He has represented the institute on the sporting field as well, and the qualities that make him effective there, composure and a willingness to lead from the front, are the same ones he brings to his academic work.</w:t>
+        <w:t xml:space="preserve">His engagement with the wider technical community extends beyond that single result. He has twice been placed second in further national competitions, on one occasion against teams drawn from leading universities, and on another taking responsibility for the final presentation under a tight deadline. He also gives his time readily to others: he serves as a Tech Mentor with EDAM IARE, guiding his juniors in the fundamentals of the field, and co-founded a tutoring initiative that he grew from three students to more than seventy over four years. He has represented the institute on the sporting field as well, and the qualities that make him effective there, composure and a willingness to lead from the front, are the same ones he brings to his academic work.</w:t>
       </w:r>
     </w:p>
     <w:p>

</xml_diff>

<commit_message>
Strengthen LOR for a research audience
Reworked the letter against the weaknesses a research committee would read it for, while holding it to one page: reframed ConfidenceOS as the research contribution it was, added a cohort-wide comparative ranking with bracketed placeholders for the signatory to complete, rebalanced the character paragraph away from compliance language towards intellectual honesty, stated the limited formal research training plainly, addressed it to the selection committee, and dropped the sporting reference. Measured at 674.8pt against 705.1pt of printable height.

Co-Authored-By: Claude Opus 5 <noreply@anthropic.com>
Claude-Session: https://claude.ai/code/session_01F7Lh9h2XEiF28VADtDzmK9
</commit_message>
<xml_diff>
--- a/documents/Nikhilesh_Kamalapurkar_LOR_Microsoft_Research_Sciences_Internship.docx
+++ b/documents/Nikhilesh_Kamalapurkar_LOR_Microsoft_Research_Sciences_Internship.docx
@@ -31,7 +31,7 @@
           <w:sz w:val="21"/>
           <w:szCs w:val="21"/>
         </w:rPr>
-        <w:t xml:space="preserve">To Whomsoever It May Concern,</w:t>
+        <w:t xml:space="preserve">To the Research Sciences Internship Selection Committee, Microsoft Research</w:t>
       </w:r>
     </w:p>
     <w:p>
@@ -63,7 +63,47 @@
           <w:sz w:val="21"/>
           <w:szCs w:val="21"/>
         </w:rPr>
-        <w:t xml:space="preserve">In my capacity as the Placement and Training Officer, I have observed Nikhilesh's academic progress, professional conduct, and overall development throughout his undergraduate studies. He has consistently maintained a strong academic record, currently holding a CGPA of 8.47/10 and on track to graduate in May 2027, and has shown discipline, responsibility, and a positive attitude toward every opportunity offered to him.</w:t>
+        <w:t xml:space="preserve">As Placement and Training Officer I oversee the training and placement of the entire graduating cohort, which gives me an unusually direct basis for comparison. Of the approximately </w:t>
+      </w:r>
+      <w:r>
+        <w:rPr>
+          <w:rFonts w:ascii="Calibri" w:cs="Calibri" w:eastAsia="Calibri" w:hAnsi="Calibri"/>
+          <w:b/>
+          <w:bCs/>
+          <w:sz w:val="21"/>
+          <w:szCs w:val="21"/>
+        </w:rPr>
+        <w:t xml:space="preserve">[NUMBER]</w:t>
+      </w:r>
+      <w:r>
+        <w:rPr>
+          <w:rFonts w:ascii="Calibri" w:cs="Calibri" w:eastAsia="Calibri" w:hAnsi="Calibri"/>
+          <w:b w:val="false"/>
+          <w:bCs w:val="false"/>
+          <w:sz w:val="21"/>
+          <w:szCs w:val="21"/>
+        </w:rPr>
+        <w:t xml:space="preserve"> students in this year's Computer Science cohort, I would place Nikhilesh in the top </w:t>
+      </w:r>
+      <w:r>
+        <w:rPr>
+          <w:rFonts w:ascii="Calibri" w:cs="Calibri" w:eastAsia="Calibri" w:hAnsi="Calibri"/>
+          <w:b/>
+          <w:bCs/>
+          <w:sz w:val="21"/>
+          <w:szCs w:val="21"/>
+        </w:rPr>
+        <w:t xml:space="preserve">[RANK]</w:t>
+      </w:r>
+      <w:r>
+        <w:rPr>
+          <w:rFonts w:ascii="Calibri" w:cs="Calibri" w:eastAsia="Calibri" w:hAnsi="Calibri"/>
+          <w:b w:val="false"/>
+          <w:bCs w:val="false"/>
+          <w:sz w:val="21"/>
+          <w:szCs w:val="21"/>
+        </w:rPr>
+        <w:t xml:space="preserve">. He holds a CGPA of 8.47/10, is on track to graduate in May 2027, and has been among the very few students I have known to pursue research questions of their own accord, without the prompting of a grade or a deadline.</w:t>
       </w:r>
     </w:p>
     <w:p>
@@ -79,7 +119,7 @@
           <w:sz w:val="21"/>
           <w:szCs w:val="21"/>
         </w:rPr>
-        <w:t xml:space="preserve">The achievement that speaks most clearly to his character is his performance at the national level. He </w:t>
+        <w:t xml:space="preserve">The clearest evidence of his research potential is his </w:t>
       </w:r>
       <w:r>
         <w:rPr>
@@ -89,17 +129,17 @@
           <w:sz w:val="21"/>
           <w:szCs w:val="21"/>
         </w:rPr>
-        <w:t xml:space="preserve">secured First Place at the ABB Accelerator National Hackathon, competing against more than 1,400 teams and over 14,000 participants from across India</w:t>
-      </w:r>
-      <w:r>
-        <w:rPr>
-          <w:rFonts w:ascii="Calibri" w:cs="Calibri" w:eastAsia="Calibri" w:hAnsi="Calibri"/>
-          <w:b w:val="false"/>
-          <w:bCs w:val="false"/>
-          <w:sz w:val="21"/>
-          <w:szCs w:val="21"/>
-        </w:rPr>
-        <w:t xml:space="preserve">. What I find telling is not the result alone but how it was achieved: he chose a difficult, unglamorous problem rather than a showy one, worked to a demanding deadline without losing composure, and presented his reasoning clearly before an expert panel. Sustaining that standard at that scale requires a persistence I have rarely seen at this stage of study.</w:t>
+        <w:t xml:space="preserve">First Place at the ABB Accelerator National Hackathon, secured against more than 1,400 teams and over 14,000 participants from across India</w:t>
+      </w:r>
+      <w:r>
+        <w:rPr>
+          <w:rFonts w:ascii="Calibri" w:cs="Calibri" w:eastAsia="Calibri" w:hAnsi="Calibri"/>
+          <w:b w:val="false"/>
+          <w:bCs w:val="false"/>
+          <w:sz w:val="21"/>
+          <w:szCs w:val="21"/>
+        </w:rPr>
+        <w:t xml:space="preserve">. The project, ConfidenceOS, was research-led rather than a rapid prototype. Before writing code his team investigated why conventional alarm-threshold monitoring fails to flag a sensor that has drifted but still reads within range, and grounded their answer in measurable physical quantities — calibration age, cross-sensor consistency, and conservation-of-mass checks — so that an operator receives a graded confidence score rather than a binary alarm. He formulated the problem himself and can defend the reasoning behind each design decision under questioning, which is what persuaded me of the depth behind the result.</w:t>
       </w:r>
     </w:p>
     <w:p>
@@ -115,7 +155,7 @@
           <w:sz w:val="21"/>
           <w:szCs w:val="21"/>
         </w:rPr>
-        <w:t xml:space="preserve">He currently serves as an AI Developer Intern at ABB Global Industries and Services Pvt. Ltd., working within a Microsoft-centred engineering environment: managing source control and CI/CD release pipelines in Azure DevOps, developing application modules on the .NET framework, and working with Azure cloud environments and virtual machines for deployment. What I would note is his conduct there. He contributes constructively in code reviews and sprint planning, reports progress honestly including when work is behind, and treats feedback from senior engineers as something to act on rather than defend against.</w:t>
+        <w:t xml:space="preserve">He currently serves as an AI Developer Intern at ABB Global Industries and Services Pvt. Ltd., within a Microsoft-centred engineering environment: managing CI/CD release pipelines in Azure DevOps, developing modules on the .NET framework, and working with Azure cloud environments and virtual machines for deployment. He contributes constructively in code reviews, reports progress honestly including when work is behind, and treats feedback as something to act on rather than defend against.</w:t>
       </w:r>
     </w:p>
     <w:p>
@@ -131,7 +171,7 @@
           <w:sz w:val="21"/>
           <w:szCs w:val="21"/>
         </w:rPr>
-        <w:t xml:space="preserve">He does not wait to be directed. Alongside his studies he founded and built RankShala, a platform that helps students identify suitable colleges from their examination rank; it reached over two hundred users within a fortnight of launch purely by word of mouth. I mention it less for the outcome than for what sustaining it shows: he will carry a responsibility over months without supervision or any guarantee of reward.</w:t>
+        <w:t xml:space="preserve">He does not wait to be directed. Alongside his studies he founded and built RankShala, a platform that helps students identify suitable colleges from their examination rank; it reached over two hundred users within a fortnight of launch purely by word of mouth, and he has sustained it over months without supervision or any guarantee of reward. He also mentors readily, serving as a Tech Mentor with EDAM IARE and co-founding a tutoring initiative he grew from three students to more than seventy.</w:t>
       </w:r>
     </w:p>
     <w:p>
@@ -147,7 +187,7 @@
           <w:sz w:val="21"/>
           <w:szCs w:val="21"/>
         </w:rPr>
-        <w:t xml:space="preserve">He gives his time readily to others, serving as a Tech Mentor with EDAM IARE and co-founding a tutoring initiative he grew from three students to more than seventy over four years. He has twice been placed second in further national competitions, and represents the institute on the sporting field.</w:t>
+        <w:t xml:space="preserve">I have found Nikhilesh to be disciplined, intellectually honest, and unusually willing to say when he does not yet know something, which in my experience is the most reliable indicator that a student will learn quickly in unfamiliar territory. He takes correction without defensiveness, but he does not simply defer: where he has evidence for a position he argues it, and he changes his mind when the argument runs against him. His conduct here has been exemplary throughout.</w:t>
       </w:r>
     </w:p>
     <w:p>
@@ -163,23 +203,7 @@
           <w:sz w:val="21"/>
           <w:szCs w:val="21"/>
         </w:rPr>
-        <w:t xml:space="preserve">I have found Nikhilesh to be disciplined, responsible, sincere, receptive to guidance, and committed to continuous learning. He is honest about the limits of what he knows, which in my experience is the most reliable indicator that a student will learn quickly in an unfamiliar environment. His conduct here has been exemplary throughout.</w:t>
-      </w:r>
-    </w:p>
-    <w:p>
-      <w:pPr>
-        <w:spacing w:after="120" w:line="252" w:lineRule="exact"/>
-        <w:jc w:val="both"/>
-      </w:pPr>
-      <w:r>
-        <w:rPr>
-          <w:rFonts w:ascii="Calibri" w:cs="Calibri" w:eastAsia="Calibri" w:hAnsi="Calibri"/>
-          <w:b w:val="false"/>
-          <w:bCs w:val="false"/>
-          <w:sz w:val="21"/>
-          <w:szCs w:val="21"/>
-        </w:rPr>
-        <w:t xml:space="preserve">A research internship at Microsoft Research would give him an excellent opportunity to develop his capabilities further, while contributing his enthusiasm and problem-solving mindset to a demanding research environment. I therefore recommend Mr. Nikhilesh Kamalapurkar, without reservation, for the Research Sciences Internship at Microsoft Research. Please contact me should you require any further information.</w:t>
+        <w:t xml:space="preserve">In fairness I should add that his formal research training is still limited; he has not yet worked inside a structured research group, and that is precisely what I believe this internship would supply. What he brings is the harder thing to teach — the instinct to ask whether a system deserves to be trusted, and the persistence to answer it. I therefore recommend Mr. Nikhilesh Kamalapurkar, without reservation, for the Research Sciences Internship at Microsoft Research, and would be glad to answer any further questions.</w:t>
       </w:r>
     </w:p>
     <w:p>

</xml_diff>

<commit_message>
Restore the source letter's second paragraph
Replaced the cohort-ranking paragraph with the wording carried over from the original letter, keeping the name and CGPA corrected. The ranking depended on a class size and rank the signatory would have had to supply, and bracketed placeholders risk being sent unfilled. Azure cloud and virtual machine work is confirmed by the applicant. Measured at 687.4pt against 705.1pt of printable height.

Co-Authored-By: Claude Opus 5 <noreply@anthropic.com>
Claude-Session: https://claude.ai/code/session_01F7Lh9h2XEiF28VADtDzmK9
</commit_message>
<xml_diff>
--- a/documents/Nikhilesh_Kamalapurkar_LOR_Microsoft_Research_Sciences_Internship.docx
+++ b/documents/Nikhilesh_Kamalapurkar_LOR_Microsoft_Research_Sciences_Internship.docx
@@ -63,47 +63,7 @@
           <w:sz w:val="21"/>
           <w:szCs w:val="21"/>
         </w:rPr>
-        <w:t xml:space="preserve">As Placement and Training Officer I oversee the training and placement of the entire graduating cohort, which gives me an unusually direct basis for comparison. Of the approximately </w:t>
-      </w:r>
-      <w:r>
-        <w:rPr>
-          <w:rFonts w:ascii="Calibri" w:cs="Calibri" w:eastAsia="Calibri" w:hAnsi="Calibri"/>
-          <w:b/>
-          <w:bCs/>
-          <w:sz w:val="21"/>
-          <w:szCs w:val="21"/>
-        </w:rPr>
-        <w:t xml:space="preserve">[NUMBER]</w:t>
-      </w:r>
-      <w:r>
-        <w:rPr>
-          <w:rFonts w:ascii="Calibri" w:cs="Calibri" w:eastAsia="Calibri" w:hAnsi="Calibri"/>
-          <w:b w:val="false"/>
-          <w:bCs w:val="false"/>
-          <w:sz w:val="21"/>
-          <w:szCs w:val="21"/>
-        </w:rPr>
-        <w:t xml:space="preserve"> students in this year's Computer Science cohort, I would place Nikhilesh in the top </w:t>
-      </w:r>
-      <w:r>
-        <w:rPr>
-          <w:rFonts w:ascii="Calibri" w:cs="Calibri" w:eastAsia="Calibri" w:hAnsi="Calibri"/>
-          <w:b/>
-          <w:bCs/>
-          <w:sz w:val="21"/>
-          <w:szCs w:val="21"/>
-        </w:rPr>
-        <w:t xml:space="preserve">[RANK]</w:t>
-      </w:r>
-      <w:r>
-        <w:rPr>
-          <w:rFonts w:ascii="Calibri" w:cs="Calibri" w:eastAsia="Calibri" w:hAnsi="Calibri"/>
-          <w:b w:val="false"/>
-          <w:bCs w:val="false"/>
-          <w:sz w:val="21"/>
-          <w:szCs w:val="21"/>
-        </w:rPr>
-        <w:t xml:space="preserve">. He holds a CGPA of 8.47/10, is on track to graduate in May 2027, and has been among the very few students I have known to pursue research questions of their own accord, without the prompting of a grade or a deadline.</w:t>
+        <w:t xml:space="preserve">In my capacity as the Placement and Training Officer at the Institute of Aeronautical Engineering, I have had the opportunity to observe Nikhilesh's academic progress, professional conduct, participation in institutional activities, and overall development throughout his undergraduate studies. He has consistently maintained a strong academic record, currently holding a CGPA of 8.47/10 and on track to graduate in May 2027, and has demonstrated discipline, responsibility, and a positive attitude toward academic and professional opportunities.</w:t>
       </w:r>
     </w:p>
     <w:p>

</xml_diff>